<commit_message>
Preview: Day 1 with Fiona's A1 wall-board changes merged in
Co-Authored-By: Claude Opus 5.5 <noreply@anthropic.com>
</commit_message>
<xml_diff>
--- a/docs/preview/Oct12_session1_materials.docx
+++ b/docs/preview/Oct12_session1_materials.docx
@@ -6727,7 +6727,7 @@
           <w:szCs w:val="22"/>
           <w:color w:val="000000"/>
         </w:rPr>
-        <w:t xml:space="preserve">If the trainer uses the wall matrix: draw a stripe in your group's colour across each excerpt slip, then tape each slip in the cell that matches your answer (row: the question it does not answer; column: act, ask first or do not act).</w:t>
+        <w:t xml:space="preserve">If the trainer uses the wall board: write each excerpt number (1 to 4) in your group's colour in the cell that matches your answer (row: the question it does not answer; column: act, ask first or do not act).</w:t>
       </w:r>
     </w:p>
     <w:p>
@@ -10872,7 +10872,7 @@
           <w:szCs w:val="26"/>
           <w:color w:val="215A9E"/>
         </w:rPr>
-        <w:t xml:space="preserve">Wall matrix (optional, alongside the triage sheet)</w:t>
+        <w:t xml:space="preserve">Wall board (optional, alongside the triage sheet)</w:t>
       </w:r>
     </w:p>
     <w:p>
@@ -10899,7 +10899,7 @@
           <w:szCs w:val="22"/>
           <w:color w:val="000000"/>
         </w:rPr>
-        <w:t xml:space="preserve">Setup, before the session: a grid on the wall (flipchart sheets, about 2 m by 1.5 m) with three columns, Act / Ask first / Do not act, and four rows, Compared to what? / How big? / How sure? / None: it answers all three. Signs are at the end of this pack. Give each group a marker in its own colour (8 colours, for example blue, green, orange, purple, black, brown, pink and red) and some masking tape.</w:t>
+        <w:t xml:space="preserve">Setup, before the session: print Oct12_session1_board_A1.pdf at A1 and tape it to the wall (preview at the end of this pack). It is a grid: three columns, Act / Ask first / Do not act, and four rows, Compared to what? / How big? / How sure? / None: it answers all three. Give each group a marker in its own colour (8 colours, for example blue, green, orange, purple, black, brown, pink and red).</w:t>
       </w:r>
     </w:p>
     <w:p>
@@ -10926,7 +10926,7 @@
           <w:szCs w:val="22"/>
           <w:color w:val="000000"/>
         </w:rPr>
-        <w:t xml:space="preserve">Running it: groups fill in the triage sheet at the table, draw a stripe of their colour across each slip and tape the four slips into the matrix. Expected: 1 in Compared to what? / Ask first; 2 in How big? / Ask first; 3 in How big? / Do not act; 4 in How sure? / Ask first. Look for the excerpts whose slips are spread across cells (usually 2 and 4) and ask two groups of different colours to explain. The Act column will probably stay empty: ask what an excerpt would need to move there (excerpt 8 on the full list is an example: a comparison, an effect and a target).</w:t>
+        <w:t xml:space="preserve">Running it: groups fill in the triage sheet at the table, then one person per group writes the four excerpt numbers in the matching cells, in the group's colour. Expected: 1 in Compared to what? / Ask first; 2 in How big? / Ask first; 3 in How big? / Do not act; 4 in How sure? / Ask first. Look for an excerpt number that appears in more than one cell (usually 2 and 4) and ask two groups of different colours to explain. The Act column will probably stay empty: ask what an excerpt would need to move there (excerpt 8 on the full list is an example: a comparison, an effect and a target).</w:t>
       </w:r>
     </w:p>
     <w:p>
@@ -10986,7 +10986,7 @@
           <w:szCs w:val="36"/>
           <w:color w:val="063360"/>
         </w:rPr>
-        <w:t xml:space="preserve">Wall board: matrix signs</w:t>
+        <w:t xml:space="preserve">Wall board: triage the claims (A1)</w:t>
       </w:r>
     </w:p>
     <w:p>
@@ -11013,439 +11013,54 @@
           <w:szCs w:val="18"/>
           <w:color w:val="215A9E"/>
         </w:rPr>
-        <w:t xml:space="preserve">Print: 1 set for the trainer, cut along the dashed lines: three column signs and four row signs</w:t>
+        <w:t xml:space="preserve">Print: send Oct12_session1_board_A1.pdf to the printer at A1 (landscape); tape it to the wall. This page is only a preview</w:t>
       </w:r>
     </w:p>
-    <w:tbl xmlns:a="http://schemas.openxmlformats.org/drawingml/2006/main" xmlns:pic="http://schemas.openxmlformats.org/drawingml/2006/picture">
-      <w:tblPr>
-        <w:tblLayout w:type="fixed"/>
-        <w:jc w:val="center"/>
-        <w:tblLook w:firstRow="1" w:lastRow="0" w:firstColumn="0" w:lastColumn="0" w:noHBand="0" w:noVBand="1"/>
-      </w:tblPr>
-      <w:tblGrid>
-        <w:gridCol w:w="9792"/>
-      </w:tblGrid>
-      <w:tr>
-        <w:trPr>
-          <w:trHeight w:val="1800" w:hRule="atLeast"/>
-        </w:trPr>
-        body1
-        <w:tc>
-          <w:tcPr>
-            <w:tcBorders>
-              <w:bottom w:val="dashed" w:sz="8" w:space="0" w:color="9AA8B8"/>
-              <w:top w:val="dashed" w:sz="8" w:space="0" w:color="9AA8B8"/>
-              <w:left w:val="dashed" w:sz="8" w:space="0" w:color="9AA8B8"/>
-              <w:right w:val="dashed" w:sz="8" w:space="0" w:color="9AA8B8"/>
-            </w:tcBorders>
-            <w:shd w:val="clear" w:color="auto" w:fill="FFFFFF"/>
-            <w:tcMar>
-              <w:top w:w="0" w:type="dxa"/>
-              <w:bottom w:w="0" w:type="dxa"/>
-              <w:left w:w="0" w:type="dxa"/>
-              <w:right w:w="0" w:type="dxa"/>
-            </w:tcMar>
-            <w:vAlign w:val="center"/>
-          </w:tcPr>
-          <w:p>
-            <w:pPr>
-              <w:jc w:val="center"/>
-              <w:pBdr>
-                <w:bottom w:val="none" w:sz="0" w:space="0" w:color="000000"/>
-                <w:top w:val="none" w:sz="0" w:space="0" w:color="000000"/>
-                <w:left w:val="none" w:sz="0" w:space="0" w:color="000000"/>
-                <w:right w:val="none" w:sz="0" w:space="0" w:color="000000"/>
-              </w:pBdr>
-              <w:spacing w:after="240" w:before="240" w:line="276"/>
-              <w:ind w:left="240" w:right="240" w:firstLine="0" w:firstLineChars="0"/>
-              <w:rPr>
-                <w:rFonts w:ascii="Arial" w:hAnsi="Arial" w:eastAsia="Arial" w:cs="Arial"/>
-                <w:i w:val="false"/>
-                <w:b w:val="false"/>
-                <w:u w:val="none"/>
-                <w:strike w:val="false"/>
-                <w:sz w:val="21"/>
-                <w:szCs w:val="21"/>
-                <w:color w:val="000000"/>
-              </w:rPr>
-            </w:pPr>
-            <w:r>
-              <w:rPr>
-                <w:rFonts w:ascii="Arial" w:hAnsi="Arial" w:eastAsia="Arial" w:cs="Arial"/>
-                <w:i w:val="false"/>
-                <w:b w:val="true"/>
-                <w:u w:val="none"/>
-                <w:strike w:val="false"/>
-                <w:sz w:val="56"/>
-                <w:szCs w:val="56"/>
-                <w:color w:val="063360"/>
-              </w:rPr>
-              <w:t xml:space="preserve">Act</w:t>
-            </w:r>
-          </w:p>
-        </w:tc>
-      </w:tr>
-      <w:tr>
-        <w:trPr>
-          <w:trHeight w:val="1800" w:hRule="atLeast"/>
-        </w:trPr>
-        body2
-        <w:tc>
-          <w:tcPr>
-            <w:tcBorders>
-              <w:bottom w:val="dashed" w:sz="8" w:space="0" w:color="9AA8B8"/>
-              <w:top w:val="dashed" w:sz="8" w:space="0" w:color="9AA8B8"/>
-              <w:left w:val="dashed" w:sz="8" w:space="0" w:color="9AA8B8"/>
-              <w:right w:val="dashed" w:sz="8" w:space="0" w:color="9AA8B8"/>
-            </w:tcBorders>
-            <w:shd w:val="clear" w:color="auto" w:fill="FFFFFF"/>
-            <w:tcMar>
-              <w:top w:w="0" w:type="dxa"/>
-              <w:bottom w:w="0" w:type="dxa"/>
-              <w:left w:w="0" w:type="dxa"/>
-              <w:right w:w="0" w:type="dxa"/>
-            </w:tcMar>
-            <w:vAlign w:val="center"/>
-          </w:tcPr>
-          <w:p>
-            <w:pPr>
-              <w:jc w:val="center"/>
-              <w:pBdr>
-                <w:bottom w:val="none" w:sz="0" w:space="0" w:color="000000"/>
-                <w:top w:val="none" w:sz="0" w:space="0" w:color="000000"/>
-                <w:left w:val="none" w:sz="0" w:space="0" w:color="000000"/>
-                <w:right w:val="none" w:sz="0" w:space="0" w:color="000000"/>
-              </w:pBdr>
-              <w:spacing w:after="240" w:before="240" w:line="276"/>
-              <w:ind w:left="240" w:right="240" w:firstLine="0" w:firstLineChars="0"/>
-              <w:rPr>
-                <w:rFonts w:ascii="Arial" w:hAnsi="Arial" w:eastAsia="Arial" w:cs="Arial"/>
-                <w:i w:val="false"/>
-                <w:b w:val="false"/>
-                <w:u w:val="none"/>
-                <w:strike w:val="false"/>
-                <w:sz w:val="21"/>
-                <w:szCs w:val="21"/>
-                <w:color w:val="000000"/>
-              </w:rPr>
-            </w:pPr>
-            <w:r>
-              <w:rPr>
-                <w:rFonts w:ascii="Arial" w:hAnsi="Arial" w:eastAsia="Arial" w:cs="Arial"/>
-                <w:i w:val="false"/>
-                <w:b w:val="true"/>
-                <w:u w:val="none"/>
-                <w:strike w:val="false"/>
-                <w:sz w:val="56"/>
-                <w:szCs w:val="56"/>
-                <w:color w:val="063360"/>
-              </w:rPr>
-              <w:t xml:space="preserve">Ask first</w:t>
-            </w:r>
-          </w:p>
-        </w:tc>
-      </w:tr>
-      <w:tr>
-        <w:trPr>
-          <w:trHeight w:val="1800" w:hRule="atLeast"/>
-        </w:trPr>
-        body3
-        <w:tc>
-          <w:tcPr>
-            <w:tcBorders>
-              <w:bottom w:val="dashed" w:sz="8" w:space="0" w:color="9AA8B8"/>
-              <w:top w:val="dashed" w:sz="8" w:space="0" w:color="9AA8B8"/>
-              <w:left w:val="dashed" w:sz="8" w:space="0" w:color="9AA8B8"/>
-              <w:right w:val="dashed" w:sz="8" w:space="0" w:color="9AA8B8"/>
-            </w:tcBorders>
-            <w:shd w:val="clear" w:color="auto" w:fill="FFFFFF"/>
-            <w:tcMar>
-              <w:top w:w="0" w:type="dxa"/>
-              <w:bottom w:w="0" w:type="dxa"/>
-              <w:left w:w="0" w:type="dxa"/>
-              <w:right w:w="0" w:type="dxa"/>
-            </w:tcMar>
-            <w:vAlign w:val="center"/>
-          </w:tcPr>
-          <w:p>
-            <w:pPr>
-              <w:jc w:val="center"/>
-              <w:pBdr>
-                <w:bottom w:val="none" w:sz="0" w:space="0" w:color="000000"/>
-                <w:top w:val="none" w:sz="0" w:space="0" w:color="000000"/>
-                <w:left w:val="none" w:sz="0" w:space="0" w:color="000000"/>
-                <w:right w:val="none" w:sz="0" w:space="0" w:color="000000"/>
-              </w:pBdr>
-              <w:spacing w:after="240" w:before="240" w:line="276"/>
-              <w:ind w:left="240" w:right="240" w:firstLine="0" w:firstLineChars="0"/>
-              <w:rPr>
-                <w:rFonts w:ascii="Arial" w:hAnsi="Arial" w:eastAsia="Arial" w:cs="Arial"/>
-                <w:i w:val="false"/>
-                <w:b w:val="false"/>
-                <w:u w:val="none"/>
-                <w:strike w:val="false"/>
-                <w:sz w:val="21"/>
-                <w:szCs w:val="21"/>
-                <w:color w:val="000000"/>
-              </w:rPr>
-            </w:pPr>
-            <w:r>
-              <w:rPr>
-                <w:rFonts w:ascii="Arial" w:hAnsi="Arial" w:eastAsia="Arial" w:cs="Arial"/>
-                <w:i w:val="false"/>
-                <w:b w:val="true"/>
-                <w:u w:val="none"/>
-                <w:strike w:val="false"/>
-                <w:sz w:val="56"/>
-                <w:szCs w:val="56"/>
-                <w:color w:val="063360"/>
-              </w:rPr>
-              <w:t xml:space="preserve">Do not act</w:t>
-            </w:r>
-          </w:p>
-        </w:tc>
-      </w:tr>
-      <w:tr>
-        <w:trPr>
-          <w:trHeight w:val="1800" w:hRule="atLeast"/>
-        </w:trPr>
-        body4
-        <w:tc>
-          <w:tcPr>
-            <w:tcBorders>
-              <w:bottom w:val="dashed" w:sz="8" w:space="0" w:color="9AA8B8"/>
-              <w:top w:val="dashed" w:sz="8" w:space="0" w:color="9AA8B8"/>
-              <w:left w:val="dashed" w:sz="8" w:space="0" w:color="9AA8B8"/>
-              <w:right w:val="dashed" w:sz="8" w:space="0" w:color="9AA8B8"/>
-            </w:tcBorders>
-            <w:shd w:val="clear" w:color="auto" w:fill="FFFFFF"/>
-            <w:tcMar>
-              <w:top w:w="0" w:type="dxa"/>
-              <w:bottom w:w="0" w:type="dxa"/>
-              <w:left w:w="0" w:type="dxa"/>
-              <w:right w:w="0" w:type="dxa"/>
-            </w:tcMar>
-            <w:vAlign w:val="center"/>
-          </w:tcPr>
-          <w:p>
-            <w:pPr>
-              <w:jc w:val="center"/>
-              <w:pBdr>
-                <w:bottom w:val="none" w:sz="0" w:space="0" w:color="000000"/>
-                <w:top w:val="none" w:sz="0" w:space="0" w:color="000000"/>
-                <w:left w:val="none" w:sz="0" w:space="0" w:color="000000"/>
-                <w:right w:val="none" w:sz="0" w:space="0" w:color="000000"/>
-              </w:pBdr>
-              <w:spacing w:after="240" w:before="240" w:line="276"/>
-              <w:ind w:left="240" w:right="240" w:firstLine="0" w:firstLineChars="0"/>
-              <w:rPr>
-                <w:rFonts w:ascii="Arial" w:hAnsi="Arial" w:eastAsia="Arial" w:cs="Arial"/>
-                <w:i w:val="false"/>
-                <w:b w:val="false"/>
-                <w:u w:val="none"/>
-                <w:strike w:val="false"/>
-                <w:sz w:val="21"/>
-                <w:szCs w:val="21"/>
-                <w:color w:val="000000"/>
-              </w:rPr>
-            </w:pPr>
-            <w:r>
-              <w:rPr>
-                <w:rFonts w:ascii="Arial" w:hAnsi="Arial" w:eastAsia="Arial" w:cs="Arial"/>
-                <w:i w:val="false"/>
-                <w:b w:val="true"/>
-                <w:u w:val="none"/>
-                <w:strike w:val="false"/>
-                <w:sz w:val="56"/>
-                <w:szCs w:val="56"/>
-                <w:color w:val="063360"/>
-              </w:rPr>
-              <w:t xml:space="preserve">Compared to what?</w:t>
-            </w:r>
-          </w:p>
-        </w:tc>
-      </w:tr>
-      <w:tr>
-        <w:trPr>
-          <w:trHeight w:val="1800" w:hRule="atLeast"/>
-        </w:trPr>
-        body5
-        <w:tc>
-          <w:tcPr>
-            <w:tcBorders>
-              <w:bottom w:val="dashed" w:sz="8" w:space="0" w:color="9AA8B8"/>
-              <w:top w:val="dashed" w:sz="8" w:space="0" w:color="9AA8B8"/>
-              <w:left w:val="dashed" w:sz="8" w:space="0" w:color="9AA8B8"/>
-              <w:right w:val="dashed" w:sz="8" w:space="0" w:color="9AA8B8"/>
-            </w:tcBorders>
-            <w:shd w:val="clear" w:color="auto" w:fill="FFFFFF"/>
-            <w:tcMar>
-              <w:top w:w="0" w:type="dxa"/>
-              <w:bottom w:w="0" w:type="dxa"/>
-              <w:left w:w="0" w:type="dxa"/>
-              <w:right w:w="0" w:type="dxa"/>
-            </w:tcMar>
-            <w:vAlign w:val="center"/>
-          </w:tcPr>
-          <w:p>
-            <w:pPr>
-              <w:jc w:val="center"/>
-              <w:pBdr>
-                <w:bottom w:val="none" w:sz="0" w:space="0" w:color="000000"/>
-                <w:top w:val="none" w:sz="0" w:space="0" w:color="000000"/>
-                <w:left w:val="none" w:sz="0" w:space="0" w:color="000000"/>
-                <w:right w:val="none" w:sz="0" w:space="0" w:color="000000"/>
-              </w:pBdr>
-              <w:spacing w:after="240" w:before="240" w:line="276"/>
-              <w:ind w:left="240" w:right="240" w:firstLine="0" w:firstLineChars="0"/>
-              <w:rPr>
-                <w:rFonts w:ascii="Arial" w:hAnsi="Arial" w:eastAsia="Arial" w:cs="Arial"/>
-                <w:i w:val="false"/>
-                <w:b w:val="false"/>
-                <w:u w:val="none"/>
-                <w:strike w:val="false"/>
-                <w:sz w:val="21"/>
-                <w:szCs w:val="21"/>
-                <w:color w:val="000000"/>
-              </w:rPr>
-            </w:pPr>
-            <w:r>
-              <w:rPr>
-                <w:rFonts w:ascii="Arial" w:hAnsi="Arial" w:eastAsia="Arial" w:cs="Arial"/>
-                <w:i w:val="false"/>
-                <w:b w:val="true"/>
-                <w:u w:val="none"/>
-                <w:strike w:val="false"/>
-                <w:sz w:val="56"/>
-                <w:szCs w:val="56"/>
-                <w:color w:val="063360"/>
-              </w:rPr>
-              <w:t xml:space="preserve">How big?</w:t>
-            </w:r>
-          </w:p>
-        </w:tc>
-      </w:tr>
-      <w:tr>
-        <w:trPr>
-          <w:trHeight w:val="1800" w:hRule="atLeast"/>
-        </w:trPr>
-        body6
-        <w:tc>
-          <w:tcPr>
-            <w:tcBorders>
-              <w:bottom w:val="dashed" w:sz="8" w:space="0" w:color="9AA8B8"/>
-              <w:top w:val="dashed" w:sz="8" w:space="0" w:color="9AA8B8"/>
-              <w:left w:val="dashed" w:sz="8" w:space="0" w:color="9AA8B8"/>
-              <w:right w:val="dashed" w:sz="8" w:space="0" w:color="9AA8B8"/>
-            </w:tcBorders>
-            <w:shd w:val="clear" w:color="auto" w:fill="FFFFFF"/>
-            <w:tcMar>
-              <w:top w:w="0" w:type="dxa"/>
-              <w:bottom w:w="0" w:type="dxa"/>
-              <w:left w:w="0" w:type="dxa"/>
-              <w:right w:w="0" w:type="dxa"/>
-            </w:tcMar>
-            <w:vAlign w:val="center"/>
-          </w:tcPr>
-          <w:p>
-            <w:pPr>
-              <w:jc w:val="center"/>
-              <w:pBdr>
-                <w:bottom w:val="none" w:sz="0" w:space="0" w:color="000000"/>
-                <w:top w:val="none" w:sz="0" w:space="0" w:color="000000"/>
-                <w:left w:val="none" w:sz="0" w:space="0" w:color="000000"/>
-                <w:right w:val="none" w:sz="0" w:space="0" w:color="000000"/>
-              </w:pBdr>
-              <w:spacing w:after="240" w:before="240" w:line="276"/>
-              <w:ind w:left="240" w:right="240" w:firstLine="0" w:firstLineChars="0"/>
-              <w:rPr>
-                <w:rFonts w:ascii="Arial" w:hAnsi="Arial" w:eastAsia="Arial" w:cs="Arial"/>
-                <w:i w:val="false"/>
-                <w:b w:val="false"/>
-                <w:u w:val="none"/>
-                <w:strike w:val="false"/>
-                <w:sz w:val="21"/>
-                <w:szCs w:val="21"/>
-                <w:color w:val="000000"/>
-              </w:rPr>
-            </w:pPr>
-            <w:r>
-              <w:rPr>
-                <w:rFonts w:ascii="Arial" w:hAnsi="Arial" w:eastAsia="Arial" w:cs="Arial"/>
-                <w:i w:val="false"/>
-                <w:b w:val="true"/>
-                <w:u w:val="none"/>
-                <w:strike w:val="false"/>
-                <w:sz w:val="56"/>
-                <w:szCs w:val="56"/>
-                <w:color w:val="063360"/>
-              </w:rPr>
-              <w:t xml:space="preserve">How sure?</w:t>
-            </w:r>
-          </w:p>
-        </w:tc>
-      </w:tr>
-      <w:tr>
-        <w:trPr>
-          <w:trHeight w:val="1800" w:hRule="atLeast"/>
-        </w:trPr>
-        body7
-        <w:tc>
-          <w:tcPr>
-            <w:tcBorders>
-              <w:bottom w:val="dashed" w:sz="8" w:space="0" w:color="9AA8B8"/>
-              <w:top w:val="dashed" w:sz="8" w:space="0" w:color="9AA8B8"/>
-              <w:left w:val="dashed" w:sz="8" w:space="0" w:color="9AA8B8"/>
-              <w:right w:val="dashed" w:sz="8" w:space="0" w:color="9AA8B8"/>
-            </w:tcBorders>
-            <w:shd w:val="clear" w:color="auto" w:fill="FFFFFF"/>
-            <w:tcMar>
-              <w:top w:w="0" w:type="dxa"/>
-              <w:bottom w:w="0" w:type="dxa"/>
-              <w:left w:w="0" w:type="dxa"/>
-              <w:right w:w="0" w:type="dxa"/>
-            </w:tcMar>
-            <w:vAlign w:val="center"/>
-          </w:tcPr>
-          <w:p>
-            <w:pPr>
-              <w:jc w:val="center"/>
-              <w:pBdr>
-                <w:bottom w:val="none" w:sz="0" w:space="0" w:color="000000"/>
-                <w:top w:val="none" w:sz="0" w:space="0" w:color="000000"/>
-                <w:left w:val="none" w:sz="0" w:space="0" w:color="000000"/>
-                <w:right w:val="none" w:sz="0" w:space="0" w:color="000000"/>
-              </w:pBdr>
-              <w:spacing w:after="240" w:before="240" w:line="276"/>
-              <w:ind w:left="240" w:right="240" w:firstLine="0" w:firstLineChars="0"/>
-              <w:rPr>
-                <w:rFonts w:ascii="Arial" w:hAnsi="Arial" w:eastAsia="Arial" w:cs="Arial"/>
-                <w:i w:val="false"/>
-                <w:b w:val="false"/>
-                <w:u w:val="none"/>
-                <w:strike w:val="false"/>
-                <w:sz w:val="21"/>
-                <w:szCs w:val="21"/>
-                <w:color w:val="000000"/>
-              </w:rPr>
-            </w:pPr>
-            <w:r>
-              <w:rPr>
-                <w:rFonts w:ascii="Arial" w:hAnsi="Arial" w:eastAsia="Arial" w:cs="Arial"/>
-                <w:i w:val="false"/>
-                <w:b w:val="true"/>
-                <w:u w:val="none"/>
-                <w:strike w:val="false"/>
-                <w:sz w:val="56"/>
-                <w:szCs w:val="56"/>
-                <w:color w:val="063360"/>
-              </w:rPr>
-              <w:t xml:space="preserve">None: it answers all three</w:t>
-            </w:r>
-          </w:p>
-        </w:tc>
-      </w:tr>
-    </w:tbl>
+    <w:p>
+      <w:pPr>
+        <w:pStyle w:val="Normal"/>
+      </w:pPr>
+      <w:r>
+        <w:rPr/>
+        <w:drawing>
+          <wp:inline distT="0" distB="0" distL="0" distR="0">
+            <wp:extent cx="6217920" cy="4392545"/>
+            <wp:docPr id="1" name="" descr=""/>
+            <wp:cNvGraphicFramePr>
+              <a:graphicFrameLocks xmlns:a="http://schemas.openxmlformats.org/drawingml/2006/main" noChangeAspect="1"/>
+            </wp:cNvGraphicFramePr>
+            <a:graphic xmlns:a="http://schemas.openxmlformats.org/drawingml/2006/main">
+              <a:graphicData uri="http://schemas.openxmlformats.org/drawingml/2006/picture">
+                <pic:pic xmlns:pic="http://schemas.openxmlformats.org/drawingml/2006/picture">
+                  <pic:nvPicPr>
+                    <pic:cNvPr id="2" name=""/>
+                    <pic:cNvPicPr>
+                      <a:picLocks noChangeAspect="1" noChangeArrowheads="1"/>
+                    </pic:cNvPicPr>
+                  </pic:nvPicPr>
+                  <pic:blipFill>
+                    <a:blip r:embed="rId7"/>
+                    <a:stretch>
+                      <a:fillRect/>
+                    </a:stretch>
+                  </pic:blipFill>
+                  <pic:spPr bwMode="auto">
+                    <a:xfrm>
+                      <a:off x="0" y="0"/>
+                      <a:ext cx="6217920" cy="4392545"/>
+                    </a:xfrm>
+                    <a:prstGeom prst="rect">
+                      <a:avLst/>
+                    </a:prstGeom>
+                    <a:noFill/>
+                  </pic:spPr>
+                </pic:pic>
+              </a:graphicData>
+            </a:graphic>
+          </wp:inline>
+        </w:drawing>
+      </w:r>
+    </w:p>
     <w:sectPr>
       <w:pgMar w:header="708" w:bottom="1008" w:top="1008" w:right="1152" w:left="1152" w:footer="708" w:gutter="0"/>
       <w:pgSz w:h="16838" w:w="11906" w:orient="portrait"/>

</xml_diff>